<commit_message>
docs(aws): bump verify reference to 1.0.1 + note 1.0.0 deprecation
@emilia-protocol/verify@1.0.1 published successfully on 2026-04-30.
1.0.0 is deprecated on the registry (recursive-canonicalize regression
fix — nested fields now deterministically signed).

Updated:
  docs/AWS-GRANT-APPLICATION.md line 143 — month 1-3 deliverable now
  references 1.0.1 as `latest` and explicitly notes 1.0.0 deprecation.
  Federal reviewers cross-checking npm registry will see consistent
  story between proposal claim and registry state.

  .docx regenerated via pandoc from the updated source.

Verified via clean-room smoke test:
  $ mkdir /tmp/ep-smoke && cd /tmp/ep-smoke
  $ npm install @emilia-protocol/verify@^1.0.1   → installs 1.0.1
  $ node -e "fetch('https://emiliaprotocol.ai/api/demo/...')..."
    → { valid: true, checks: { signature: true, ... } }

Tagged: verify-v1.0.1 (pushed to origin)

Co-Authored-By: Claude Opus 4.7 (1M context) <noreply@anthropic.com>
</commit_message>
<xml_diff>
--- a/docs/AWS-Grant-Application-EP.docx
+++ b/docs/AWS-Grant-Application-EP.docx
@@ -2171,10 +2171,22 @@
               <w:rPr>
                 <w:rStyle w:val="VerbatimChar"/>
               </w:rPr>
-              <w:t xml:space="preserve">@emilia-protocol/verify@1.0.0</w:t>
-            </w:r>
-            <w:r>
-              <w:t xml:space="preserve">). Python/Go/Rust ports + third-party audit of the crypto implementation.</w:t>
+              <w:t xml:space="preserve">@emilia-protocol/verify@1.0.1</w:t>
+            </w:r>
+            <w:r>
+              <w:t xml:space="preserve">, current</w:t>
+            </w:r>
+            <w:r>
+              <w:t xml:space="preserve"> </w:t>
+            </w:r>
+            <w:r>
+              <w:rPr>
+                <w:rStyle w:val="VerbatimChar"/>
+              </w:rPr>
+              <w:t xml:space="preserve">latest</w:t>
+            </w:r>
+            <w:r>
+              <w:t xml:space="preserve">; 1.0.0 deprecated for shallow-canonicalization regression). Python/Go/Rust ports + third-party audit of the crypto implementation.</w:t>
             </w:r>
           </w:p>
         </w:tc>

</xml_diff>